<commit_message>
docs: regenerate the PDF and Word of the actions and the technical, user and administrator manuals
</commit_message>
<xml_diff>
--- a/08_ACCIONES_CORRECTIVAS_PREVENTIVAS_Y_DE_MEJORA/EN/WORD/08_Corrective_Preventive_And_Improvement_Actions.docx
+++ b/08_ACCIONES_CORRECTIVAS_PREVENTIVAS_Y_DE_MEJORA/EN/WORD/08_Corrective_Preventive_And_Improvement_Actions.docx
@@ -359,6 +359,52 @@
             </w:pPr>
             <w:r>
               <w:t xml:space="preserve">Preventive action AP-01 was closed with continuous integration in GitHub Actions in the 10 repositories.</w:t>
+            </w:r>
+          </w:p>
+        </w:tc>
+        <w:tc>
+          <w:tcPr/>
+          <w:p>
+            <w:pPr>
+              <w:pStyle w:val="Compact"/>
+            </w:pPr>
+            <w:r>
+              <w:t xml:space="preserve">Development team</w:t>
+            </w:r>
+          </w:p>
+        </w:tc>
+      </w:tr>
+      <w:tr>
+        <w:tc>
+          <w:tcPr/>
+          <w:p>
+            <w:pPr>
+              <w:pStyle w:val="Compact"/>
+            </w:pPr>
+            <w:r>
+              <w:t xml:space="preserve">2.3</w:t>
+            </w:r>
+          </w:p>
+        </w:tc>
+        <w:tc>
+          <w:tcPr/>
+          <w:p>
+            <w:pPr>
+              <w:pStyle w:val="Compact"/>
+            </w:pPr>
+            <w:r>
+              <w:t xml:space="preserve">2026-10-19</w:t>
+            </w:r>
+          </w:p>
+        </w:tc>
+        <w:tc>
+          <w:tcPr/>
+          <w:p>
+            <w:pPr>
+              <w:pStyle w:val="Compact"/>
+            </w:pPr>
+            <w:r>
+              <w:t xml:space="preserve">Test indicator with the run of October 19 (655 automated, 19 end-to-end, and 42 functional cases).</w:t>
             </w:r>
           </w:p>
         </w:tc>
@@ -12393,7 +12439,7 @@
               <w:pStyle w:val="Compact"/>
             </w:pPr>
             <w:r>
-              <w:t xml:space="preserve">639 unit and integration tests (web 43, gateway 34, Java services 421, and payment-service 141) and 19 end-to-end tests</w:t>
+              <w:t xml:space="preserve">655 unit and integration tests (web 43, gateway 34, Java services 430, and payment-service 148) as of October 19, 2026, 19 end-to-end tests, and 42 functional cases</w:t>
             </w:r>
           </w:p>
         </w:tc>

</xml_diff>

<commit_message>
docs(actions): update the corrective and improvement actions (2.4)
</commit_message>
<xml_diff>
--- a/08_ACCIONES_CORRECTIVAS_PREVENTIVAS_Y_DE_MEJORA/EN/WORD/08_Corrective_Preventive_And_Improvement_Actions.docx
+++ b/08_ACCIONES_CORRECTIVAS_PREVENTIVAS_Y_DE_MEJORA/EN/WORD/08_Corrective_Preventive_And_Improvement_Actions.docx
@@ -32,7 +32,7 @@
         <w:pStyle w:val="BodyText"/>
       </w:pPr>
       <w:r>
-        <w:t xml:space="preserve">Brayan Estiven Patiño Cabrera (Project Leader), Juan Camilo Guilombo Osorio (Frontend Leader), and Merari Urbano (Backend Leader)</w:t>
+        <w:t xml:space="preserve">Brayan Estiven Patiño Cabrera (Project Leader), Juan Camilo Guilombo Osorio (Frontend Leader), and Merari Urbano Quintero (Backend Leader)</w:t>
       </w:r>
     </w:p>
     <w:p>
@@ -64,7 +64,7 @@
         <w:pStyle w:val="BodyText"/>
       </w:pPr>
       <w:r>
-        <w:t xml:space="preserve">October 17, 2026</w:t>
+        <w:t xml:space="preserve">October 20, 2026</w:t>
       </w:r>
     </w:p>
     <w:p>
@@ -72,7 +72,7 @@
         <w:pStyle w:val="BodyText"/>
       </w:pPr>
       <w:r>
-        <w:t xml:space="preserve">Document Type: Register of Corrective, Preventive, and Improvement Actions (Development Team and Instructor) · Version 2.1</w:t>
+        <w:t xml:space="preserve">Document Type: Register of Corrective, Preventive, and Improvement Actions (Development Team and Instructor) · Version 2.4</w:t>
       </w:r>
     </w:p>
     <w:bookmarkStart w:id="20" w:name="version-control"/>
@@ -405,6 +405,52 @@
             </w:pPr>
             <w:r>
               <w:t xml:space="preserve">Test indicator with the run of October 19 (655 automated, 19 end-to-end, and 42 functional cases).</w:t>
+            </w:r>
+          </w:p>
+        </w:tc>
+        <w:tc>
+          <w:tcPr/>
+          <w:p>
+            <w:pPr>
+              <w:pStyle w:val="Compact"/>
+            </w:pPr>
+            <w:r>
+              <w:t xml:space="preserve">Development team</w:t>
+            </w:r>
+          </w:p>
+        </w:tc>
+      </w:tr>
+      <w:tr>
+        <w:tc>
+          <w:tcPr/>
+          <w:p>
+            <w:pPr>
+              <w:pStyle w:val="Compact"/>
+            </w:pPr>
+            <w:r>
+              <w:t xml:space="preserve">2.4</w:t>
+            </w:r>
+          </w:p>
+        </w:tc>
+        <w:tc>
+          <w:tcPr/>
+          <w:p>
+            <w:pPr>
+              <w:pStyle w:val="Compact"/>
+            </w:pPr>
+            <w:r>
+              <w:t xml:space="preserve">2026-10-20</w:t>
+            </w:r>
+          </w:p>
+        </w:tc>
+        <w:tc>
+          <w:tcPr/>
+          <w:p>
+            <w:pPr>
+              <w:pStyle w:val="Compact"/>
+            </w:pPr>
+            <w:r>
+              <w:t xml:space="preserve">Review against the code of October 20, 2026: the register is still current (AM-03, rescheduling from the web and the app, and AM-12, the pause and issue states, remain open); the backend leader's full name was completed.</w:t>
             </w:r>
           </w:p>
         </w:tc>
@@ -3107,7 +3153,7 @@
               <w:pStyle w:val="Compact"/>
             </w:pPr>
             <w:r>
-              <w:t xml:space="preserve">Merari Urbano</w:t>
+              <w:t xml:space="preserve">Merari Urbano Quintero</w:t>
             </w:r>
           </w:p>
         </w:tc>

</xml_diff>

<commit_message>
docs(actions): regenerate the PDF and Word
</commit_message>
<xml_diff>
--- a/08_ACCIONES_CORRECTIVAS_PREVENTIVAS_Y_DE_MEJORA/EN/WORD/08_Corrective_Preventive_And_Improvement_Actions.docx
+++ b/08_ACCIONES_CORRECTIVAS_PREVENTIVAS_Y_DE_MEJORA/EN/WORD/08_Corrective_Preventive_And_Improvement_Actions.docx
@@ -2,7 +2,7 @@
 <file path=word/document.xml><?xml version="1.0" encoding="utf-8"?>
 <w:document xmlns:w="http://schemas.openxmlformats.org/wordprocessingml/2006/main" xmlns:m="http://schemas.openxmlformats.org/officeDocument/2006/math" xmlns:r="http://schemas.openxmlformats.org/officeDocument/2006/relationships" xmlns:o="urn:schemas-microsoft-com:office:office" xmlns:v="urn:schemas-microsoft-com:vml" xmlns:w10="urn:schemas-microsoft-com:office:word" xmlns:a="http://schemas.openxmlformats.org/drawingml/2006/main" xmlns:pic="http://schemas.openxmlformats.org/drawingml/2006/picture" xmlns:wp="http://schemas.openxmlformats.org/drawingml/2006/wordprocessingDrawing">
   <w:body>
-    <w:bookmarkStart w:id="46" w:name="Xb78c25b4c11aba388441637b82b0c5e43496b1b"/>
+    <w:bookmarkStart w:id="47" w:name="Xb78c25b4c11aba388441637b82b0c5e43496b1b"/>
     <w:p>
       <w:pPr>
         <w:pStyle w:val="Heading1"/>
@@ -64,7 +64,7 @@
         <w:pStyle w:val="BodyText"/>
       </w:pPr>
       <w:r>
-        <w:t xml:space="preserve">October 26, 2026</w:t>
+        <w:t xml:space="preserve">October 27, 2026</w:t>
       </w:r>
     </w:p>
     <w:p>
@@ -72,7 +72,7 @@
         <w:pStyle w:val="BodyText"/>
       </w:pPr>
       <w:r>
-        <w:t xml:space="preserve">Document Type: Register of Corrective, Preventive, and Improvement Actions (Development Team and Instructor) · Version 3.2</w:t>
+        <w:t xml:space="preserve">Document Type: Register of Corrective, Preventive, and Improvement Actions (Development Team and Instructor) · Version 3.3</w:t>
       </w:r>
     </w:p>
     <w:bookmarkStart w:id="9" w:name="version-control"/>
@@ -1017,6 +1017,96 @@
             </w:pPr>
             <w:r>
               <w:t xml:space="preserve">Test count of October 27, 2026 (booking 137, customer-service 83: 1,311) and payment persistence tests in the CI (Table 10).</w:t>
+            </w:r>
+          </w:p>
+        </w:tc>
+        <w:tc>
+          <w:tcPr/>
+          <w:p>
+            <w:pPr>
+              <w:pStyle w:val="Compact"/>
+            </w:pPr>
+            <w:r>
+              <w:t xml:space="preserve">Development team</w:t>
+            </w:r>
+          </w:p>
+        </w:tc>
+      </w:tr>
+      <w:tr>
+        <w:tc>
+          <w:tcPr/>
+          <w:p>
+            <w:pPr>
+              <w:pStyle w:val="Compact"/>
+            </w:pPr>
+            <w:r>
+              <w:t xml:space="preserve">3.3</w:t>
+            </w:r>
+          </w:p>
+        </w:tc>
+        <w:tc>
+          <w:tcPr/>
+          <w:p>
+            <w:pPr>
+              <w:pStyle w:val="Compact"/>
+            </w:pPr>
+            <w:r>
+              <w:t xml:space="preserve">2026-10-27</w:t>
+            </w:r>
+          </w:p>
+        </w:tc>
+        <w:tc>
+          <w:tcPr/>
+          <w:p>
+            <w:pPr>
+              <w:pStyle w:val="Compact"/>
+            </w:pPr>
+            <w:r>
+              <w:t xml:space="preserve">Versions</w:t>
+            </w:r>
+            <w:r>
+              <w:t xml:space="preserve"> </w:t>
+            </w:r>
+            <w:r>
+              <w:rPr>
+                <w:i/>
+                <w:iCs/>
+              </w:rPr>
+              <w:t xml:space="preserve">v1.1.1</w:t>
+            </w:r>
+            <w:r>
+              <w:t xml:space="preserve"> </w:t>
+            </w:r>
+            <w:r>
+              <w:t xml:space="preserve">and</w:t>
+            </w:r>
+            <w:r>
+              <w:t xml:space="preserve"> </w:t>
+            </w:r>
+            <w:r>
+              <w:rPr>
+                <w:i/>
+                <w:iCs/>
+              </w:rPr>
+              <w:t xml:space="preserve">v1.1.2</w:t>
+            </w:r>
+            <w:r>
+              <w:t xml:space="preserve"> </w:t>
+            </w:r>
+            <w:r>
+              <w:t xml:space="preserve">of October 27. AC-91 (400 instead of 500 with an invalid list of services or opening-hours week), AC-92 (</w:t>
+            </w:r>
+            <w:r>
+              <w:rPr>
+                <w:rStyle w:val="VerbatimChar"/>
+              </w:rPr>
+              <w:t xml:space="preserve">bookedBy</w:t>
+            </w:r>
+            <w:r>
+              <w:t xml:space="preserve"> </w:t>
+            </w:r>
+            <w:r>
+              <w:t xml:space="preserve">visible to the customer), and AC-93 (alternative times the vehicle could not take) were closed. ACO-42 (example legal contact data), ACO-43 (bookings without pagination), and ACO-44 (payment history screen, RF-015) were opened. Progress of ACO-24 and ACO-26; H-01 and H-02 become Fixed, H-15 becomes Partial (the machine is still turned on on demand and the external monitor is missing), and H-21 becomes Partial (backgrounds in WebP). Table 10 (93 of 112, 1,337 tests), AM-18, L-19, and Annex C were recalculated.</w:t>
             </w:r>
           </w:p>
         </w:tc>
@@ -17389,6 +17479,587 @@
           </w:p>
         </w:tc>
       </w:tr>
+      <w:tr>
+        <w:tc>
+          <w:tcPr/>
+          <w:p>
+            <w:pPr>
+              <w:pStyle w:val="Compact"/>
+            </w:pPr>
+            <w:r>
+              <w:t xml:space="preserve">AC-91</w:t>
+            </w:r>
+          </w:p>
+        </w:tc>
+        <w:tc>
+          <w:tcPr/>
+          <w:p>
+            <w:pPr>
+              <w:pStyle w:val="Compact"/>
+            </w:pPr>
+            <w:r>
+              <w:t xml:space="preserve">booking-service returned 500 when the list of services of a booking held a null value or was too long (a list with no cap broke SQL Server's</w:t>
+            </w:r>
+            <w:r>
+              <w:t xml:space="preserve"> </w:t>
+            </w:r>
+            <w:r>
+              <w:rPr>
+                <w:rStyle w:val="VerbatimChar"/>
+              </w:rPr>
+              <w:t xml:space="preserve">IN</w:t>
+            </w:r>
+            <w:r>
+              <w:t xml:space="preserve">), and also when a day of the opening-hours week was invalid.</w:t>
+            </w:r>
+          </w:p>
+        </w:tc>
+        <w:tc>
+          <w:tcPr/>
+          <w:p>
+            <w:pPr>
+              <w:pStyle w:val="Compact"/>
+            </w:pPr>
+            <w:r>
+              <w:t xml:space="preserve">P3</w:t>
+            </w:r>
+          </w:p>
+        </w:tc>
+        <w:tc>
+          <w:tcPr/>
+          <w:p>
+            <w:pPr>
+              <w:pStyle w:val="Compact"/>
+            </w:pPr>
+            <w:r>
+              <w:t xml:space="preserve">The body validation did not check each element of the list or cap it.</w:t>
+            </w:r>
+          </w:p>
+        </w:tc>
+        <w:tc>
+          <w:tcPr/>
+          <w:p>
+            <w:pPr>
+              <w:pStyle w:val="Compact"/>
+            </w:pPr>
+            <w:r>
+              <w:rPr>
+                <w:rStyle w:val="VerbatimChar"/>
+              </w:rPr>
+              <w:t xml:space="preserve">serviceIds</w:t>
+            </w:r>
+            <w:r>
+              <w:t xml:space="preserve"> </w:t>
+            </w:r>
+            <w:r>
+              <w:t xml:space="preserve">with</w:t>
+            </w:r>
+            <w:r>
+              <w:t xml:space="preserve"> </w:t>
+            </w:r>
+            <w:r>
+              <w:rPr>
+                <w:rStyle w:val="VerbatimChar"/>
+              </w:rPr>
+              <w:t xml:space="preserve">@NotEmpty</w:t>
+            </w:r>
+            <w:r>
+              <w:t xml:space="preserve">,</w:t>
+            </w:r>
+            <w:r>
+              <w:t xml:space="preserve"> </w:t>
+            </w:r>
+            <w:r>
+              <w:rPr>
+                <w:rStyle w:val="VerbatimChar"/>
+              </w:rPr>
+              <w:t xml:space="preserve">@Size(max = 10)</w:t>
+            </w:r>
+            <w:r>
+              <w:t xml:space="preserve">, and</w:t>
+            </w:r>
+            <w:r>
+              <w:t xml:space="preserve"> </w:t>
+            </w:r>
+            <w:r>
+              <w:rPr>
+                <w:rStyle w:val="VerbatimChar"/>
+              </w:rPr>
+              <w:t xml:space="preserve">@NotNull @Positive</w:t>
+            </w:r>
+            <w:r>
+              <w:t xml:space="preserve"> </w:t>
+            </w:r>
+            <w:r>
+              <w:t xml:space="preserve">elements when creating and rescheduling (at most 10 services per booking), and validation of each day of the opening-hours week: they return 400</w:t>
+            </w:r>
+            <w:r>
+              <w:t xml:space="preserve"> </w:t>
+            </w:r>
+            <w:r>
+              <w:rPr>
+                <w:rStyle w:val="VerbatimChar"/>
+              </w:rPr>
+              <w:t xml:space="preserve">VALIDATION_ERROR</w:t>
+            </w:r>
+            <w:r>
+              <w:t xml:space="preserve">.</w:t>
+            </w:r>
+          </w:p>
+        </w:tc>
+        <w:tc>
+          <w:tcPr/>
+          <w:p>
+            <w:pPr>
+              <w:pStyle w:val="Compact"/>
+            </w:pPr>
+            <w:r>
+              <w:t xml:space="preserve">booking</w:t>
+            </w:r>
+            <w:r>
+              <w:t xml:space="preserve"> </w:t>
+            </w:r>
+            <w:r>
+              <w:rPr>
+                <w:i/>
+                <w:iCs/>
+              </w:rPr>
+              <w:t xml:space="preserve">87b25f5</w:t>
+            </w:r>
+            <w:r>
+              <w:t xml:space="preserve"> </w:t>
+            </w:r>
+            <w:r>
+              <w:t xml:space="preserve">and</w:t>
+            </w:r>
+            <w:r>
+              <w:t xml:space="preserve"> </w:t>
+            </w:r>
+            <w:r>
+              <w:rPr>
+                <w:i/>
+                <w:iCs/>
+              </w:rPr>
+              <w:t xml:space="preserve">54d4125</w:t>
+            </w:r>
+            <w:r>
+              <w:t xml:space="preserve"> </w:t>
+            </w:r>
+            <w:r>
+              <w:t xml:space="preserve">(merge</w:t>
+            </w:r>
+            <w:r>
+              <w:t xml:space="preserve"> </w:t>
+            </w:r>
+            <w:r>
+              <w:rPr>
+                <w:i/>
+                <w:iCs/>
+              </w:rPr>
+              <w:t xml:space="preserve">8032aef</w:t>
+            </w:r>
+            <w:r>
+              <w:t xml:space="preserve">);</w:t>
+            </w:r>
+            <w:r>
+              <w:t xml:space="preserve"> </w:t>
+            </w:r>
+            <w:r>
+              <w:rPr>
+                <w:rStyle w:val="VerbatimChar"/>
+              </w:rPr>
+              <w:t xml:space="preserve">BookingApiWebTest.nullOrTooManyServicesAreValidationErrors</w:t>
+            </w:r>
+            <w:r>
+              <w:t xml:space="preserve"> </w:t>
+            </w:r>
+            <w:r>
+              <w:t xml:space="preserve">and</w:t>
+            </w:r>
+            <w:r>
+              <w:t xml:space="preserve"> </w:t>
+            </w:r>
+            <w:r>
+              <w:rPr>
+                <w:rStyle w:val="VerbatimChar"/>
+              </w:rPr>
+              <w:t xml:space="preserve">anInvalidDayInTheWeekIsAValidationError</w:t>
+            </w:r>
+            <w:r>
+              <w:t xml:space="preserve">, green in the CI. Version</w:t>
+            </w:r>
+            <w:r>
+              <w:t xml:space="preserve"> </w:t>
+            </w:r>
+            <w:r>
+              <w:rPr>
+                <w:i/>
+                <w:iCs/>
+              </w:rPr>
+              <w:t xml:space="preserve">v1.1.1</w:t>
+            </w:r>
+            <w:r>
+              <w:t xml:space="preserve">, deployed on October 27.</w:t>
+            </w:r>
+          </w:p>
+        </w:tc>
+        <w:tc>
+          <w:tcPr/>
+          <w:p>
+            <w:pPr>
+              <w:pStyle w:val="Compact"/>
+            </w:pPr>
+            <w:r>
+              <w:t xml:space="preserve">Review of 2026-10-27</w:t>
+            </w:r>
+          </w:p>
+        </w:tc>
+        <w:tc>
+          <w:tcPr/>
+          <w:p>
+            <w:pPr>
+              <w:pStyle w:val="Compact"/>
+            </w:pPr>
+            <w:r>
+              <w:t xml:space="preserve">2026-10-27</w:t>
+            </w:r>
+          </w:p>
+        </w:tc>
+      </w:tr>
+      <w:tr>
+        <w:tc>
+          <w:tcPr/>
+          <w:p>
+            <w:pPr>
+              <w:pStyle w:val="Compact"/>
+            </w:pPr>
+            <w:r>
+              <w:t xml:space="preserve">AC-92</w:t>
+            </w:r>
+          </w:p>
+        </w:tc>
+        <w:tc>
+          <w:tcPr/>
+          <w:p>
+            <w:pPr>
+              <w:pStyle w:val="Compact"/>
+            </w:pPr>
+            <w:r>
+              <w:t xml:space="preserve">The booking response to the customer included</w:t>
+            </w:r>
+            <w:r>
+              <w:t xml:space="preserve"> </w:t>
+            </w:r>
+            <w:r>
+              <w:rPr>
+                <w:rStyle w:val="VerbatimChar"/>
+              </w:rPr>
+              <w:t xml:space="preserve">bookedBy</w:t>
+            </w:r>
+            <w:r>
+              <w:t xml:space="preserve">, the identifier of the account that created it, although only the staff needs it.</w:t>
+            </w:r>
+          </w:p>
+        </w:tc>
+        <w:tc>
+          <w:tcPr/>
+          <w:p>
+            <w:pPr>
+              <w:pStyle w:val="Compact"/>
+            </w:pPr>
+            <w:r>
+              <w:t xml:space="preserve">P3</w:t>
+            </w:r>
+          </w:p>
+        </w:tc>
+        <w:tc>
+          <w:tcPr/>
+          <w:p>
+            <w:pPr>
+              <w:pStyle w:val="Compact"/>
+            </w:pPr>
+            <w:r>
+              <w:t xml:space="preserve">The customer's and the staff's views used the same response conversion.</w:t>
+            </w:r>
+          </w:p>
+        </w:tc>
+        <w:tc>
+          <w:tcPr/>
+          <w:p>
+            <w:pPr>
+              <w:pStyle w:val="Compact"/>
+            </w:pPr>
+            <w:r>
+              <w:rPr>
+                <w:rStyle w:val="VerbatimChar"/>
+              </w:rPr>
+              <w:t xml:space="preserve">BookingResponse.from(view, includeOwner)</w:t>
+            </w:r>
+            <w:r>
+              <w:t xml:space="preserve">:</w:t>
+            </w:r>
+            <w:r>
+              <w:t xml:space="preserve"> </w:t>
+            </w:r>
+            <w:r>
+              <w:rPr>
+                <w:rStyle w:val="VerbatimChar"/>
+              </w:rPr>
+              <w:t xml:space="preserve">bookedBy</w:t>
+            </w:r>
+            <w:r>
+              <w:t xml:space="preserve"> </w:t>
+            </w:r>
+            <w:r>
+              <w:t xml:space="preserve">and the vehicle owner are only filled in the administrator's and the operator's views.</w:t>
+            </w:r>
+          </w:p>
+        </w:tc>
+        <w:tc>
+          <w:tcPr/>
+          <w:p>
+            <w:pPr>
+              <w:pStyle w:val="Compact"/>
+            </w:pPr>
+            <w:r>
+              <w:t xml:space="preserve">booking</w:t>
+            </w:r>
+            <w:r>
+              <w:t xml:space="preserve"> </w:t>
+            </w:r>
+            <w:r>
+              <w:rPr>
+                <w:i/>
+                <w:iCs/>
+              </w:rPr>
+              <w:t xml:space="preserve">6cc2b86</w:t>
+            </w:r>
+            <w:r>
+              <w:t xml:space="preserve"> </w:t>
+            </w:r>
+            <w:r>
+              <w:t xml:space="preserve">(merge</w:t>
+            </w:r>
+            <w:r>
+              <w:t xml:space="preserve"> </w:t>
+            </w:r>
+            <w:r>
+              <w:rPr>
+                <w:i/>
+                <w:iCs/>
+              </w:rPr>
+              <w:t xml:space="preserve">04cdb94</w:t>
+            </w:r>
+            <w:r>
+              <w:t xml:space="preserve">). Version</w:t>
+            </w:r>
+            <w:r>
+              <w:t xml:space="preserve"> </w:t>
+            </w:r>
+            <w:r>
+              <w:rPr>
+                <w:i/>
+                <w:iCs/>
+              </w:rPr>
+              <w:t xml:space="preserve">v1.1.1</w:t>
+            </w:r>
+            <w:r>
+              <w:t xml:space="preserve">, deployed on October 27.</w:t>
+            </w:r>
+          </w:p>
+        </w:tc>
+        <w:tc>
+          <w:tcPr/>
+          <w:p>
+            <w:pPr>
+              <w:pStyle w:val="Compact"/>
+            </w:pPr>
+            <w:r>
+              <w:t xml:space="preserve">Review of 2026-10-27</w:t>
+            </w:r>
+          </w:p>
+        </w:tc>
+        <w:tc>
+          <w:tcPr/>
+          <w:p>
+            <w:pPr>
+              <w:pStyle w:val="Compact"/>
+            </w:pPr>
+            <w:r>
+              <w:t xml:space="preserve">2026-10-27</w:t>
+            </w:r>
+          </w:p>
+        </w:tc>
+      </w:tr>
+      <w:tr>
+        <w:tc>
+          <w:tcPr/>
+          <w:p>
+            <w:pPr>
+              <w:pStyle w:val="Compact"/>
+            </w:pPr>
+            <w:r>
+              <w:t xml:space="preserve">AC-93</w:t>
+            </w:r>
+          </w:p>
+        </w:tc>
+        <w:tc>
+          <w:tcPr/>
+          <w:p>
+            <w:pPr>
+              <w:pStyle w:val="Compact"/>
+            </w:pPr>
+            <w:r>
+              <w:t xml:space="preserve">With the time taken, booking offered as alternatives times that clashed with another booking of the same vehicle; when chosen, the booking failed with 409</w:t>
+            </w:r>
+            <w:r>
+              <w:t xml:space="preserve"> </w:t>
+            </w:r>
+            <w:r>
+              <w:rPr>
+                <w:rStyle w:val="VerbatimChar"/>
+              </w:rPr>
+              <w:t xml:space="preserve">VEHICLE_ALREADY_BOOKED</w:t>
+            </w:r>
+            <w:r>
+              <w:t xml:space="preserve">.</w:t>
+            </w:r>
+          </w:p>
+        </w:tc>
+        <w:tc>
+          <w:tcPr/>
+          <w:p>
+            <w:pPr>
+              <w:pStyle w:val="Compact"/>
+            </w:pPr>
+            <w:r>
+              <w:t xml:space="preserve">P3</w:t>
+            </w:r>
+          </w:p>
+        </w:tc>
+        <w:tc>
+          <w:tcPr/>
+          <w:p>
+            <w:pPr>
+              <w:pStyle w:val="Compact"/>
+            </w:pPr>
+            <w:r>
+              <w:t xml:space="preserve">The alternatives only looked at the free bays, not at the vehicle's other bookings.</w:t>
+            </w:r>
+          </w:p>
+        </w:tc>
+        <w:tc>
+          <w:tcPr/>
+          <w:p>
+            <w:pPr>
+              <w:pStyle w:val="Compact"/>
+            </w:pPr>
+            <w:r>
+              <w:rPr>
+                <w:rStyle w:val="VerbatimChar"/>
+              </w:rPr>
+              <w:t xml:space="preserve">AvailabilityPolicy.withoutBusyTimes</w:t>
+            </w:r>
+            <w:r>
+              <w:t xml:space="preserve"> </w:t>
+            </w:r>
+            <w:r>
+              <w:t xml:space="preserve">removes from the alternatives the times that clash with another booking of the same vehicle.</w:t>
+            </w:r>
+          </w:p>
+        </w:tc>
+        <w:tc>
+          <w:tcPr/>
+          <w:p>
+            <w:pPr>
+              <w:pStyle w:val="Compact"/>
+            </w:pPr>
+            <w:r>
+              <w:t xml:space="preserve">booking</w:t>
+            </w:r>
+            <w:r>
+              <w:t xml:space="preserve"> </w:t>
+            </w:r>
+            <w:r>
+              <w:rPr>
+                <w:i/>
+                <w:iCs/>
+              </w:rPr>
+              <w:t xml:space="preserve">578c5a1</w:t>
+            </w:r>
+            <w:r>
+              <w:t xml:space="preserve"> </w:t>
+            </w:r>
+            <w:r>
+              <w:t xml:space="preserve">and</w:t>
+            </w:r>
+            <w:r>
+              <w:t xml:space="preserve"> </w:t>
+            </w:r>
+            <w:r>
+              <w:rPr>
+                <w:i/>
+                <w:iCs/>
+              </w:rPr>
+              <w:t xml:space="preserve">da233d5</w:t>
+            </w:r>
+            <w:r>
+              <w:t xml:space="preserve"> </w:t>
+            </w:r>
+            <w:r>
+              <w:t xml:space="preserve">(merge</w:t>
+            </w:r>
+            <w:r>
+              <w:t xml:space="preserve"> </w:t>
+            </w:r>
+            <w:r>
+              <w:rPr>
+                <w:i/>
+                <w:iCs/>
+              </w:rPr>
+              <w:t xml:space="preserve">6d9c8e9</w:t>
+            </w:r>
+            <w:r>
+              <w:t xml:space="preserve">). Version</w:t>
+            </w:r>
+            <w:r>
+              <w:t xml:space="preserve"> </w:t>
+            </w:r>
+            <w:r>
+              <w:rPr>
+                <w:i/>
+                <w:iCs/>
+              </w:rPr>
+              <w:t xml:space="preserve">v1.1.1</w:t>
+            </w:r>
+            <w:r>
+              <w:t xml:space="preserve">, deployed on October 27.</w:t>
+            </w:r>
+          </w:p>
+        </w:tc>
+        <w:tc>
+          <w:tcPr/>
+          <w:p>
+            <w:pPr>
+              <w:pStyle w:val="Compact"/>
+            </w:pPr>
+            <w:r>
+              <w:t xml:space="preserve">Review of 2026-10-27</w:t>
+            </w:r>
+          </w:p>
+        </w:tc>
+        <w:tc>
+          <w:tcPr/>
+          <w:p>
+            <w:pPr>
+              <w:pStyle w:val="Compact"/>
+            </w:pPr>
+            <w:r>
+              <w:t xml:space="preserve">2026-10-27</w:t>
+            </w:r>
+          </w:p>
+        </w:tc>
+      </w:tr>
     </w:tbl>
     <w:p>
       <w:pPr>
@@ -17479,11 +18150,43 @@
         <w:t xml:space="preserve"> </w:t>
       </w:r>
       <w:r>
-        <w:t xml:space="preserve">and in production since October 26, 2026 (booking-service, payment-service, and the web); AC-88 is a preventive and improvement action, but it is recorded here with the next AC number because it was born from a concrete finding (the question of the final presentation) and was closed with evidence.</w:t>
+        <w:t xml:space="preserve">and in production since October 26, 2026 (booking-service, payment-service, and the web); AC-88 is a preventive and improvement action, but it is recorded here with the next AC number because it was born from a concrete finding (the question of the final presentation) and was closed with evidence. AC-91 to AC-93 are on</w:t>
+      </w:r>
+      <w:r>
+        <w:t xml:space="preserve"> </w:t>
+      </w:r>
+      <w:r>
+        <w:rPr>
+          <w:i/>
+          <w:iCs/>
+        </w:rPr>
+        <w:t xml:space="preserve">main</w:t>
+      </w:r>
+      <w:r>
+        <w:t xml:space="preserve"> </w:t>
+      </w:r>
+      <w:r>
+        <w:t xml:space="preserve">since booking-service</w:t>
+      </w:r>
+      <w:r>
+        <w:t xml:space="preserve"> </w:t>
+      </w:r>
+      <w:r>
+        <w:rPr>
+          <w:i/>
+          <w:iCs/>
+        </w:rPr>
+        <w:t xml:space="preserve">v1.1.1</w:t>
+      </w:r>
+      <w:r>
+        <w:t xml:space="preserve"> </w:t>
+      </w:r>
+      <w:r>
+        <w:t xml:space="preserve">(October 27, 2026) and in production since that early morning's continuous deployment.</w:t>
       </w:r>
     </w:p>
     <w:bookmarkEnd w:id="28"/>
-    <w:bookmarkStart w:id="29" w:name="X9f1be8ed7857815a4815c10086b2c76e39e7e32"/>
+    <w:bookmarkStart w:id="30" w:name="X9f1be8ed7857815a4815c10086b2c76e39e7e32"/>
     <w:p>
       <w:pPr>
         <w:pStyle w:val="Heading2"/>
@@ -17911,7 +18614,7 @@
               <w:t xml:space="preserve"> </w:t>
             </w:r>
             <w:r>
-              <w:t xml:space="preserve">is not protected in any repository (H-02). Progress as of October 26, 2026: the mobile app now has a version in</w:t>
+              <w:t xml:space="preserve">is not protected in any repository (H-02). Progress as of October 27, 2026: the 10 repositories have their release on</w:t>
             </w:r>
             <w:r>
               <w:t xml:space="preserve"> </w:t>
@@ -17937,7 +18640,7 @@
               <w:t xml:space="preserve">v1.1.0</w:t>
             </w:r>
             <w:r>
-              <w:t xml:space="preserve">, PR #1, and</w:t>
+              <w:t xml:space="preserve">,</w:t>
             </w:r>
             <w:r>
               <w:t xml:space="preserve"> </w:t>
@@ -17950,7 +18653,65 @@
               <w:t xml:space="preserve">v1.1.1</w:t>
             </w:r>
             <w:r>
-              <w:t xml:space="preserve">, PR #2), payment-service has</w:t>
+              <w:t xml:space="preserve">, or</w:t>
+            </w:r>
+            <w:r>
+              <w:t xml:space="preserve"> </w:t>
+            </w:r>
+            <w:r>
+              <w:rPr>
+                <w:i/>
+                <w:iCs/>
+              </w:rPr>
+              <w:t xml:space="preserve">v1.1.2</w:t>
+            </w:r>
+            <w:r>
+              <w:t xml:space="preserve">),</w:t>
+            </w:r>
+            <w:r>
+              <w:t xml:space="preserve"> </w:t>
+            </w:r>
+            <w:r>
+              <w:rPr>
+                <w:i/>
+                <w:iCs/>
+              </w:rPr>
+              <w:t xml:space="preserve">main</w:t>
+            </w:r>
+            <w:r>
+              <w:t xml:space="preserve"> </w:t>
+            </w:r>
+            <w:r>
+              <w:t xml:space="preserve">is protected in all of them, and the public server runs</w:t>
+            </w:r>
+            <w:r>
+              <w:t xml:space="preserve"> </w:t>
+            </w:r>
+            <w:r>
+              <w:rPr>
+                <w:i/>
+                <w:iCs/>
+              </w:rPr>
+              <w:t xml:space="preserve">main</w:t>
+            </w:r>
+            <w:r>
+              <w:t xml:space="preserve">; payment-service is deployed from</w:t>
+            </w:r>
+            <w:r>
+              <w:t xml:space="preserve"> </w:t>
+            </w:r>
+            <w:r>
+              <w:rPr>
+                <w:i/>
+                <w:iCs/>
+              </w:rPr>
+              <w:t xml:space="preserve">main</w:t>
+            </w:r>
+            <w:r>
+              <w:t xml:space="preserve"> </w:t>
+            </w:r>
+            <w:r>
+              <w:t xml:space="preserve">since infra</w:t>
             </w:r>
             <w:r>
               <w:t xml:space="preserve"> </w:t>
@@ -17963,39 +18724,7 @@
               <w:t xml:space="preserve">v1.1.1</w:t>
             </w:r>
             <w:r>
-              <w:t xml:space="preserve"> </w:t>
-            </w:r>
-            <w:r>
-              <w:t xml:space="preserve">and is deployed from</w:t>
-            </w:r>
-            <w:r>
-              <w:t xml:space="preserve"> </w:t>
-            </w:r>
-            <w:r>
-              <w:rPr>
-                <w:i/>
-                <w:iCs/>
-              </w:rPr>
-              <w:t xml:space="preserve">main</w:t>
-            </w:r>
-            <w:r>
-              <w:t xml:space="preserve"> </w:t>
-            </w:r>
-            <w:r>
-              <w:t xml:space="preserve">(removed from</w:t>
-            </w:r>
-            <w:r>
-              <w:t xml:space="preserve"> </w:t>
-            </w:r>
-            <w:r>
-              <w:rPr>
-                <w:i/>
-                <w:iCs/>
-              </w:rPr>
-              <w:t xml:space="preserve">DEVELOP_ONLY</w:t>
-            </w:r>
-            <w:r>
-              <w:t xml:space="preserve">).</w:t>
+              <w:t xml:space="preserve">.</w:t>
             </w:r>
           </w:p>
         </w:tc>
@@ -18317,7 +19046,7 @@
               <w:t xml:space="preserve">e2e.yml</w:t>
             </w:r>
             <w:r>
-              <w:t xml:space="preserve">, 44 cases) exists but has only been tested against a simulator, and payment's 11 integration tests are skipped in the CI (F-01 to F-05, H-13).</w:t>
+              <w:t xml:space="preserve">, 44 cases) exists but has only been tested against a simulator, and the 19 local end-to-end tests do not run in the CI (F-01 to F-05, H-13). Progress as of October 27, 2026: payment-service's 17 integration tests already run in the CI ("Pruebas de integración" job, against SQL Server 2022 with the Liquibase migrations) and the 19 end-to-end tests passed 19 of 19 locally that day.</w:t>
             </w:r>
           </w:p>
         </w:tc>
@@ -18339,7 +19068,7 @@
               <w:pStyle w:val="Compact"/>
             </w:pPr>
             <w:r>
-              <w:t xml:space="preserve">The CI does not start SQL Server or RabbitMQ and the test accounts are missing in production.</w:t>
+              <w:t xml:space="preserve">The CI does not start the complete system and the test accounts are missing in production.</w:t>
             </w:r>
           </w:p>
         </w:tc>
@@ -18395,7 +19124,7 @@
               <w:t xml:space="preserve">allow_writes</w:t>
             </w:r>
             <w:r>
-              <w:t xml:space="preserve">), and a workflow with containers for the integration tests.</w:t>
+              <w:t xml:space="preserve">), bring the end-to-end tests into the CI, and add integration tests to the other services.</w:t>
             </w:r>
           </w:p>
         </w:tc>
@@ -18438,7 +19167,7 @@
               <w:t xml:space="preserve"> </w:t>
             </w:r>
             <w:r>
-              <w:t xml:space="preserve">green against Azure and the integration tests run.</w:t>
+              <w:t xml:space="preserve">green against Azure, the end-to-end tests in the CI, and the other services' integration tests run (payment's, done).</w:t>
             </w:r>
           </w:p>
         </w:tc>
@@ -19849,6 +20578,398 @@
             </w:pPr>
             <w:r>
               <w:t xml:space="preserve">Rule implemented with its test and tested live, or discarded with a justification.</w:t>
+            </w:r>
+          </w:p>
+        </w:tc>
+      </w:tr>
+      <w:tr>
+        <w:tc>
+          <w:tcPr/>
+          <w:p>
+            <w:pPr>
+              <w:pStyle w:val="Compact"/>
+            </w:pPr>
+            <w:r>
+              <w:t xml:space="preserve">ACO-42</w:t>
+            </w:r>
+          </w:p>
+        </w:tc>
+        <w:tc>
+          <w:tcPr/>
+          <w:p>
+            <w:pPr>
+              <w:pStyle w:val="Compact"/>
+            </w:pPr>
+            <w:r>
+              <w:t xml:space="preserve">The Terms and Conditions and the Data Processing Policy of the web and the app carry example contact data: email</w:t>
+            </w:r>
+            <w:r>
+              <w:t xml:space="preserve"> </w:t>
+            </w:r>
+            <w:hyperlink r:id="rId29">
+              <w:r>
+                <w:rPr>
+                  <w:rStyle w:val="Hyperlink"/>
+                  <w:i/>
+                  <w:iCs/>
+                </w:rPr>
+                <w:t xml:space="preserve">datos@expresscarwash.co</w:t>
+              </w:r>
+            </w:hyperlink>
+            <w:r>
+              <w:t xml:space="preserve">, phone</w:t>
+            </w:r>
+            <w:r>
+              <w:t xml:space="preserve"> </w:t>
+            </w:r>
+            <w:r>
+              <w:rPr>
+                <w:i/>
+                <w:iCs/>
+              </w:rPr>
+              <w:t xml:space="preserve">+57 300 123 4567</w:t>
+            </w:r>
+            <w:r>
+              <w:t xml:space="preserve">, tax ID (NIT), and address.</w:t>
+            </w:r>
+          </w:p>
+        </w:tc>
+        <w:tc>
+          <w:tcPr/>
+          <w:p>
+            <w:pPr>
+              <w:pStyle w:val="Compact"/>
+            </w:pPr>
+            <w:r>
+              <w:t xml:space="preserve">P2</w:t>
+            </w:r>
+          </w:p>
+        </w:tc>
+        <w:tc>
+          <w:tcPr/>
+          <w:p>
+            <w:pPr>
+              <w:pStyle w:val="Compact"/>
+            </w:pPr>
+            <w:r>
+              <w:t xml:space="preserve">The legal texts were written before having the real data of the data controller.</w:t>
+            </w:r>
+          </w:p>
+        </w:tc>
+        <w:tc>
+          <w:tcPr/>
+          <w:p>
+            <w:pPr>
+              <w:pStyle w:val="Compact"/>
+            </w:pPr>
+            <w:r>
+              <w:t xml:space="preserve">Replace the email, phone, tax ID, and address with the car wash's in the 4 languages of the web and the app.</w:t>
+            </w:r>
+          </w:p>
+        </w:tc>
+        <w:tc>
+          <w:tcPr/>
+          <w:p>
+            <w:pPr>
+              <w:pStyle w:val="Compact"/>
+            </w:pPr>
+            <w:r>
+              <w:t xml:space="preserve">Project leader</w:t>
+            </w:r>
+          </w:p>
+        </w:tc>
+        <w:tc>
+          <w:tcPr/>
+          <w:p>
+            <w:pPr>
+              <w:pStyle w:val="Compact"/>
+            </w:pPr>
+            <w:r>
+              <w:t xml:space="preserve">High</w:t>
+            </w:r>
+          </w:p>
+        </w:tc>
+        <w:tc>
+          <w:tcPr/>
+          <w:p>
+            <w:pPr>
+              <w:pStyle w:val="Compact"/>
+            </w:pPr>
+            <w:r>
+              <w:t xml:space="preserve">The published legal texts show the real data of the controller (Law 1581 of 2012).</w:t>
+            </w:r>
+          </w:p>
+        </w:tc>
+      </w:tr>
+      <w:tr>
+        <w:tc>
+          <w:tcPr/>
+          <w:p>
+            <w:pPr>
+              <w:pStyle w:val="Compact"/>
+            </w:pPr>
+            <w:r>
+              <w:t xml:space="preserve">ACO-43</w:t>
+            </w:r>
+          </w:p>
+        </w:tc>
+        <w:tc>
+          <w:tcPr/>
+          <w:p>
+            <w:pPr>
+              <w:pStyle w:val="Compact"/>
+            </w:pPr>
+            <w:r>
+              <w:t xml:space="preserve">The booking lists are not requested by pages:</w:t>
+            </w:r>
+            <w:r>
+              <w:t xml:space="preserve"> </w:t>
+            </w:r>
+            <w:r>
+              <w:rPr>
+                <w:i/>
+                <w:iCs/>
+              </w:rPr>
+              <w:t xml:space="preserve">GET /bookings/me</w:t>
+            </w:r>
+            <w:r>
+              <w:t xml:space="preserve"> </w:t>
+            </w:r>
+            <w:r>
+              <w:t xml:space="preserve">returns all of the customer's and</w:t>
+            </w:r>
+            <w:r>
+              <w:t xml:space="preserve"> </w:t>
+            </w:r>
+            <w:r>
+              <w:rPr>
+                <w:i/>
+                <w:iCs/>
+              </w:rPr>
+              <w:t xml:space="preserve">GET /admin/bookings</w:t>
+            </w:r>
+            <w:r>
+              <w:t xml:space="preserve"> </w:t>
+            </w:r>
+            <w:r>
+              <w:t xml:space="preserve">all of the range, with no cap.</w:t>
+            </w:r>
+          </w:p>
+        </w:tc>
+        <w:tc>
+          <w:tcPr/>
+          <w:p>
+            <w:pPr>
+              <w:pStyle w:val="Compact"/>
+            </w:pPr>
+            <w:r>
+              <w:t xml:space="preserve">P3</w:t>
+            </w:r>
+          </w:p>
+        </w:tc>
+        <w:tc>
+          <w:tcPr/>
+          <w:p>
+            <w:pPr>
+              <w:pStyle w:val="Compact"/>
+            </w:pPr>
+            <w:r>
+              <w:t xml:space="preserve">The screens were built with little test data.</w:t>
+            </w:r>
+          </w:p>
+        </w:tc>
+        <w:tc>
+          <w:tcPr/>
+          <w:p>
+            <w:pPr>
+              <w:pStyle w:val="Compact"/>
+            </w:pPr>
+            <w:r>
+              <w:t xml:space="preserve">Add</w:t>
+            </w:r>
+            <w:r>
+              <w:t xml:space="preserve"> </w:t>
+            </w:r>
+            <w:r>
+              <w:rPr>
+                <w:i/>
+                <w:iCs/>
+              </w:rPr>
+              <w:t xml:space="preserve">page</w:t>
+            </w:r>
+            <w:r>
+              <w:t xml:space="preserve"> </w:t>
+            </w:r>
+            <w:r>
+              <w:t xml:space="preserve">and</w:t>
+            </w:r>
+            <w:r>
+              <w:t xml:space="preserve"> </w:t>
+            </w:r>
+            <w:r>
+              <w:rPr>
+                <w:i/>
+                <w:iCs/>
+              </w:rPr>
+              <w:t xml:space="preserve">size</w:t>
+            </w:r>
+            <w:r>
+              <w:t xml:space="preserve"> </w:t>
+            </w:r>
+            <w:r>
+              <w:t xml:space="preserve">to both routes and request them by pages in the web and the app.</w:t>
+            </w:r>
+          </w:p>
+        </w:tc>
+        <w:tc>
+          <w:tcPr/>
+          <w:p>
+            <w:pPr>
+              <w:pStyle w:val="Compact"/>
+            </w:pPr>
+            <w:r>
+              <w:t xml:space="preserve">Frontend leader (booking-service)</w:t>
+            </w:r>
+          </w:p>
+        </w:tc>
+        <w:tc>
+          <w:tcPr/>
+          <w:p>
+            <w:pPr>
+              <w:pStyle w:val="Compact"/>
+            </w:pPr>
+            <w:r>
+              <w:t xml:space="preserve">Medium</w:t>
+            </w:r>
+          </w:p>
+        </w:tc>
+        <w:tc>
+          <w:tcPr/>
+          <w:p>
+            <w:pPr>
+              <w:pStyle w:val="Compact"/>
+            </w:pPr>
+            <w:r>
+              <w:t xml:space="preserve">The booking lists load by pages with real data.</w:t>
+            </w:r>
+          </w:p>
+        </w:tc>
+      </w:tr>
+      <w:tr>
+        <w:tc>
+          <w:tcPr/>
+          <w:p>
+            <w:pPr>
+              <w:pStyle w:val="Compact"/>
+            </w:pPr>
+            <w:r>
+              <w:t xml:space="preserve">ACO-44</w:t>
+            </w:r>
+          </w:p>
+        </w:tc>
+        <w:tc>
+          <w:tcPr/>
+          <w:p>
+            <w:pPr>
+              <w:pStyle w:val="Compact"/>
+            </w:pPr>
+            <w:r>
+              <w:t xml:space="preserve">The web has no payment history screen (RF-015 partial):</w:t>
+            </w:r>
+            <w:r>
+              <w:t xml:space="preserve"> </w:t>
+            </w:r>
+            <w:r>
+              <w:rPr>
+                <w:i/>
+                <w:iCs/>
+              </w:rPr>
+              <w:t xml:space="preserve">/client/history</w:t>
+            </w:r>
+            <w:r>
+              <w:t xml:space="preserve"> </w:t>
+            </w:r>
+            <w:r>
+              <w:t xml:space="preserve">is the booking history and nobody uses the filters of</w:t>
+            </w:r>
+            <w:r>
+              <w:t xml:space="preserve"> </w:t>
+            </w:r>
+            <w:r>
+              <w:rPr>
+                <w:i/>
+                <w:iCs/>
+              </w:rPr>
+              <w:t xml:space="preserve">GET /payments/me</w:t>
+            </w:r>
+            <w:r>
+              <w:t xml:space="preserve">.</w:t>
+            </w:r>
+          </w:p>
+        </w:tc>
+        <w:tc>
+          <w:tcPr/>
+          <w:p>
+            <w:pPr>
+              <w:pStyle w:val="Compact"/>
+            </w:pPr>
+            <w:r>
+              <w:t xml:space="preserve">P3</w:t>
+            </w:r>
+          </w:p>
+        </w:tc>
+        <w:tc>
+          <w:tcPr/>
+          <w:p>
+            <w:pPr>
+              <w:pStyle w:val="Compact"/>
+            </w:pPr>
+            <w:r>
+              <w:t xml:space="preserve">The payment history was covered with the payment status of each booking.</w:t>
+            </w:r>
+          </w:p>
+        </w:tc>
+        <w:tc>
+          <w:tcPr/>
+          <w:p>
+            <w:pPr>
+              <w:pStyle w:val="Compact"/>
+            </w:pPr>
+            <w:r>
+              <w:t xml:space="preserve">Customer payment history screen with the API's date and service filters.</w:t>
+            </w:r>
+          </w:p>
+        </w:tc>
+        <w:tc>
+          <w:tcPr/>
+          <w:p>
+            <w:pPr>
+              <w:pStyle w:val="Compact"/>
+            </w:pPr>
+            <w:r>
+              <w:t xml:space="preserve">Frontend leader</w:t>
+            </w:r>
+          </w:p>
+        </w:tc>
+        <w:tc>
+          <w:tcPr/>
+          <w:p>
+            <w:pPr>
+              <w:pStyle w:val="Compact"/>
+            </w:pPr>
+            <w:r>
+              <w:t xml:space="preserve">Medium</w:t>
+            </w:r>
+          </w:p>
+        </w:tc>
+        <w:tc>
+          <w:tcPr/>
+          <w:p>
+            <w:pPr>
+              <w:pStyle w:val="Compact"/>
+            </w:pPr>
+            <w:r>
+              <w:t xml:space="preserve">RF-015 implemented and with its test case green.</w:t>
             </w:r>
           </w:p>
         </w:tc>
@@ -19869,11 +20990,11 @@
         <w:t xml:space="preserve"> </w:t>
       </w:r>
       <w:r>
-        <w:t xml:space="preserve">Prepared by the authors from the technical backlog, Annex B of the Technical Manual, and the verification of the code. ACO-01 to ACO-03 and ACO-05 to ACO-12 moved to Table 6 as AC-24 to AC-34, and ACO-14 as AC-55 (October 23, 2026). On October 24, 2026, ACO-15 to ACO-18, ACO-20 to ACO-23, ACO-27, ACO-29, ACO-31, and ACO-32 were closed (AC-73 to AC-84) and ACO-33 to ACO-40 were opened with the pending items of that day's final cross review. On October 26, 2026 ACO-41 was opened, the pending improvement of payment at booking, and that night ACO-19 was closed as AC-90 (first run of continuous deployment).</w:t>
+        <w:t xml:space="preserve">Prepared by the authors from the technical backlog, Annex B of the Technical Manual, and the verification of the code. ACO-01 to ACO-03 and ACO-05 to ACO-12 moved to Table 6 as AC-24 to AC-34, and ACO-14 as AC-55 (October 23, 2026). On October 24, 2026, ACO-15 to ACO-18, ACO-20 to ACO-23, ACO-27, ACO-29, ACO-31, and ACO-32 were closed (AC-73 to AC-84) and ACO-33 to ACO-40 were opened with the pending items of that day's final cross review. On October 26, 2026 ACO-41 was opened, the pending improvement of payment at booking, and that night ACO-19 was closed as AC-90 (first run of continuous deployment). On October 27, 2026 ACO-42 to ACO-44 were opened with real pending items that were not recorded.</w:t>
       </w:r>
     </w:p>
-    <w:bookmarkEnd w:id="29"/>
-    <w:bookmarkStart w:id="30" w:name="X9d07ddbd247ccc65003d3634518175b22c0f833"/>
+    <w:bookmarkEnd w:id="30"/>
+    <w:bookmarkStart w:id="31" w:name="X9d07ddbd247ccc65003d3634518175b22c0f833"/>
     <w:p>
       <w:pPr>
         <w:pStyle w:val="Heading2"/>
@@ -21965,8 +23086,8 @@
         <w:t xml:space="preserve">Prepared by the authors from the risk register, the technical backlog, and the security policy of the project.</w:t>
       </w:r>
     </w:p>
-    <w:bookmarkEnd w:id="30"/>
-    <w:bookmarkStart w:id="31" w:name="Xb5d91f6cf5d1bb53ecdce7b01edc2ece0df5658"/>
+    <w:bookmarkEnd w:id="31"/>
+    <w:bookmarkStart w:id="32" w:name="Xb5d91f6cf5d1bb53ecdce7b01edc2ece0df5658"/>
     <w:p>
       <w:pPr>
         <w:pStyle w:val="Heading2"/>
@@ -23649,7 +24770,7 @@
               <w:pStyle w:val="Compact"/>
             </w:pPr>
             <w:r>
-              <w:t xml:space="preserve">In progress (2026-10-24): the web has 212 tests in 66 files, with coverage in the CI (real guard and interceptor, coupon payment, refresh, and translations of the 4 languages), and the app 73 tests in 25 suites (ACO-26)</w:t>
+              <w:t xml:space="preserve">In progress (2026-10-27): the web has 242 tests in 68 files, with coverage in the CI (real guard and interceptor, coupon payment, refresh, and translations of the 4 languages), and the app 106 tests (ACO-26)</w:t>
             </w:r>
           </w:p>
         </w:tc>
@@ -23779,8 +24900,8 @@
         <w:t xml:space="preserve">Prepared by the authors from the recommended evolution of the Technical Manual, the ADRs, and the limitations documented in the manuals.</w:t>
       </w:r>
     </w:p>
-    <w:bookmarkEnd w:id="31"/>
-    <w:bookmarkStart w:id="32" w:name="Xb99184e64d23bb71c8908bb8edd03bf98726080"/>
+    <w:bookmarkEnd w:id="32"/>
+    <w:bookmarkStart w:id="33" w:name="Xb99184e64d23bb71c8908bb8edd03bf98726080"/>
     <w:p>
       <w:pPr>
         <w:pStyle w:val="Heading2"/>
@@ -23869,7 +24990,7 @@
               <w:pStyle w:val="Compact"/>
             </w:pPr>
             <w:r>
-              <w:t xml:space="preserve">Value as of 2026-10-26</w:t>
+              <w:t xml:space="preserve">Value as of 2026-10-27</w:t>
             </w:r>
           </w:p>
         </w:tc>
@@ -23915,7 +25036,7 @@
               <w:pStyle w:val="Compact"/>
             </w:pPr>
             <w:r>
-              <w:t xml:space="preserve">90 / 106 = 85% (on the afternoon of 2026-10-26 it was 89 / 106; on 2026-10-24, 87 / 103; on 2026-10-23, 72 / 92; on 2026-10-21, 54 / 57)</w:t>
+              <w:t xml:space="preserve">93 / 112 = 83% (on 2026-10-26 it was 90 / 106 and in the afternoon 89 / 106; on 2026-10-24, 87 / 103; on 2026-10-23, 72 / 92; on 2026-10-21, 54 / 57)</w:t>
             </w:r>
           </w:p>
         </w:tc>
@@ -24145,7 +25266,23 @@
               <w:pStyle w:val="Compact"/>
             </w:pPr>
             <w:r>
-              <w:t xml:space="preserve">On October 26, 2026 booking (133), payment-service (247, without the integration tests), the web (239), and the mobile app (100) changed; with the other artifacts of the latest CI of October 24, 1,306 without payment's infrastructure project (on October 24 it was 1,187 with the same criterion and 1,192 with it); on October 27, 2026 booking went up to 137 and customer-service to 83, for 1,311 with the same criterion, and payment's 11 persistence tests started running in the CI against SQL Server. In addition, the live test of payment at booking of October 26 (11 tests, 2 of them simulated failures), 19 end-to-end tests on October 21, and 42 functional cases on October 19</w:t>
+              <w:t xml:space="preserve">1,337 in the</w:t>
+            </w:r>
+            <w:r>
+              <w:t xml:space="preserve"> </w:t>
+            </w:r>
+            <w:r>
+              <w:rPr>
+                <w:i/>
+                <w:iCs/>
+              </w:rPr>
+              <w:t xml:space="preserve">main</w:t>
+            </w:r>
+            <w:r>
+              <w:t xml:space="preserve"> </w:t>
+            </w:r>
+            <w:r>
+              <w:t xml:space="preserve">CI of October 27, 2026, all passed: gateway 62, security-service 200, customer-service 83, booking-service 137, operations-service 110, notification-service 133, payment-service 264 (with the 17 integration tests, which run against SQL Server), web 242, and mobile app 106; the 19 end-to-end tests passed locally that day. Before: on October 26, 2026 booking (133), payment-service (247, without the integration tests), the web (239), and the mobile app (100) changed; with the other artifacts of the latest CI of October 24, 1,306 without payment's infrastructure project (on October 24 it was 1,187 with the same criterion and 1,192 with it); on October 27, 2026 booking went up to 137 and customer-service to 83, for 1,311 with the same criterion, and payment's persistence tests started running in the CI against SQL Server. In addition, the live test of payment at booking of October 26 (11 tests, 2 of them simulated failures) and 42 functional cases on October 19</w:t>
             </w:r>
           </w:p>
         </w:tc>
@@ -24195,7 +25332,23 @@
         <w:t xml:space="preserve">v1.0.0</w:t>
       </w:r>
       <w:r>
-        <w:t xml:space="preserve">, 757; on October 21, 707); version 1.0 counted annotations (about 400). On October 26, 2026 the counts of booking, payment, the web, and the mobile app were added (Test document, Table 5f). The recorded corrective actions count AC-01 to AC-90 (AC-88 is preventive and improvement, but has an AC number) and the 16 open ACOs.</w:t>
+        <w:t xml:space="preserve">, 757; on October 21, 707); version 1.0 counted annotations (about 400). On October 26, 2026 the counts of booking, payment, the web, and the mobile app were added (Test document, Table 5f). On October 27, 2026 the count of the</w:t>
+      </w:r>
+      <w:r>
+        <w:t xml:space="preserve"> </w:t>
+      </w:r>
+      <w:r>
+        <w:rPr>
+          <w:i/>
+          <w:iCs/>
+        </w:rPr>
+        <w:t xml:space="preserve">main</w:t>
+      </w:r>
+      <w:r>
+        <w:t xml:space="preserve"> </w:t>
+      </w:r>
+      <w:r>
+        <w:t xml:space="preserve">CI was taken (Test document, Table 5f). The recorded corrective actions count AC-01 to AC-93 (AC-88 is preventive and improvement, but has an AC number) and the 19 open ACOs.</w:t>
       </w:r>
     </w:p>
     <w:p>
@@ -24203,7 +25356,7 @@
         <w:pStyle w:val="BodyText"/>
       </w:pPr>
       <w:r>
-        <w:t xml:space="preserve">The project leader reviews the indicators at each retrospective and before each implementation. As of October 26, 2026 there are 16 open corrective actions (ACO-04, ACO-13, ACO-24 to ACO-26, ACO-28, ACO-30, and ACO-33 to ACO-41), all P2 or P3 and with a recorded action. Since no P0 or P1 remains,</w:t>
+        <w:t xml:space="preserve">The project leader reviews the indicators at each retrospective and before each implementation. As of October 27, 2026 there are 19 open corrective actions (ACO-04, ACO-13, ACO-24 to ACO-26, ACO-28, ACO-30, and ACO-33 to ACO-44), all P2 or P3 and with a recorded action. Since no P0 or P1 remains,</w:t>
       </w:r>
       <w:r>
         <w:t xml:space="preserve"> </w:t>
@@ -24235,8 +25388,8 @@
         <w:t xml:space="preserve">. The highest priority is ACO-33 (the web's unpaginated payment queue), which should be closed before loading real data.</w:t>
       </w:r>
     </w:p>
-    <w:bookmarkEnd w:id="32"/>
-    <w:bookmarkStart w:id="33" w:name="X0cb26df771c038803c701845d20bc119e3e0425"/>
+    <w:bookmarkEnd w:id="33"/>
+    <w:bookmarkStart w:id="34" w:name="X0cb26df771c038803c701845d20bc119e3e0425"/>
     <w:p>
       <w:pPr>
         <w:pStyle w:val="Heading2"/>
@@ -24967,7 +26120,7 @@
               <w:pStyle w:val="Compact"/>
             </w:pPr>
             <w:r>
-              <w:t xml:space="preserve">A migration is not tested until the service reads and writes the table in a real SQL Server: unit tests, which run without a database, do not see type clashes between the database, the driver, and Hibernate. The live test after deploying found the one in 047; that is why the integration tests against SQL Server in the CI are still pending (RNF-003, ACO-26, and AP-07), and the live test after each deployment stays.</w:t>
+              <w:t xml:space="preserve">A migration is not tested until the service reads and writes the table in a real SQL Server: unit tests, which run without a database, do not see type clashes between the database, the driver, and Hibernate. The live test after deploying found the one in 047; since October 27, 2026 payment-service's integration tests run in the CI against SQL Server 2022 with the Liquibase migrations, and those of the other services are still pending (RNF-003, ACO-26, and AP-07); the live test after each deployment stays.</w:t>
             </w:r>
           </w:p>
         </w:tc>
@@ -25037,8 +26190,8 @@
         <w:t xml:space="preserve">Prepared by the authors from the register of closed risks and the actions of this document.</w:t>
       </w:r>
     </w:p>
-    <w:bookmarkEnd w:id="33"/>
-    <w:bookmarkStart w:id="34" w:name="Xdce06a4ec52ad5d8ecc4233264fbfd4b968d612"/>
+    <w:bookmarkEnd w:id="34"/>
+    <w:bookmarkStart w:id="35" w:name="Xdce06a4ec52ad5d8ecc4233264fbfd4b968d612"/>
     <w:p>
       <w:pPr>
         <w:pStyle w:val="Heading2"/>
@@ -25415,8 +26568,8 @@
         <w:t xml:space="preserve">Prepared by the authors from ISO (2015), ISO et al. (2022), and the project documentation.</w:t>
       </w:r>
     </w:p>
-    <w:bookmarkEnd w:id="34"/>
-    <w:bookmarkStart w:id="40" w:name="references"/>
+    <w:bookmarkEnd w:id="35"/>
+    <w:bookmarkStart w:id="41" w:name="references"/>
     <w:p>
       <w:pPr>
         <w:pStyle w:val="Heading2"/>
@@ -25451,7 +26604,7 @@
       <w:r>
         <w:t xml:space="preserve"> </w:t>
       </w:r>
-      <w:hyperlink r:id="rId35">
+      <w:hyperlink r:id="rId36">
         <w:r>
           <w:rPr>
             <w:rStyle w:val="Hyperlink"/>
@@ -25486,7 +26639,7 @@
       <w:r>
         <w:t xml:space="preserve"> </w:t>
       </w:r>
-      <w:hyperlink r:id="rId36">
+      <w:hyperlink r:id="rId37">
         <w:r>
           <w:rPr>
             <w:rStyle w:val="Hyperlink"/>
@@ -25521,7 +26674,7 @@
       <w:r>
         <w:t xml:space="preserve"> </w:t>
       </w:r>
-      <w:hyperlink r:id="rId37">
+      <w:hyperlink r:id="rId38">
         <w:r>
           <w:rPr>
             <w:rStyle w:val="Hyperlink"/>
@@ -25556,7 +26709,7 @@
       <w:r>
         <w:t xml:space="preserve"> </w:t>
       </w:r>
-      <w:hyperlink r:id="rId38">
+      <w:hyperlink r:id="rId39">
         <w:r>
           <w:rPr>
             <w:rStyle w:val="Hyperlink"/>
@@ -25615,7 +26768,7 @@
       <w:r>
         <w:t xml:space="preserve"> </w:t>
       </w:r>
-      <w:hyperlink r:id="rId39">
+      <w:hyperlink r:id="rId40">
         <w:r>
           <w:rPr>
             <w:rStyle w:val="Hyperlink"/>
@@ -25624,8 +26777,8 @@
         </w:r>
       </w:hyperlink>
     </w:p>
-    <w:bookmarkEnd w:id="40"/>
-    <w:bookmarkStart w:id="45" w:name="X5f0c3d51cd883a46315354854757497093e7a01"/>
+    <w:bookmarkEnd w:id="41"/>
+    <w:bookmarkStart w:id="46" w:name="X5f0c3d51cd883a46315354854757497093e7a01"/>
     <w:p>
       <w:pPr>
         <w:pStyle w:val="Heading2"/>
@@ -25634,7 +26787,7 @@
         <w:t xml:space="preserve">16. Annexes</w:t>
       </w:r>
     </w:p>
-    <w:bookmarkStart w:id="41" w:name="annex-a-action-record-form"/>
+    <w:bookmarkStart w:id="42" w:name="annex-a-action-record-form"/>
     <w:p>
       <w:pPr>
         <w:pStyle w:val="Heading3"/>
@@ -26005,8 +27158,8 @@
         </w:tc>
       </w:tr>
     </w:tbl>
-    <w:bookmarkEnd w:id="41"/>
-    <w:bookmarkStart w:id="42" w:name="annex-b-root-cause-analysis-example"/>
+    <w:bookmarkEnd w:id="42"/>
+    <w:bookmarkStart w:id="43" w:name="annex-b-root-cause-analysis-example"/>
     <w:p>
       <w:pPr>
         <w:pStyle w:val="Heading3"/>
@@ -26256,8 +27409,8 @@
         <w:t xml:space="preserve">Prepared by the authors from the closed risk C-001 of the project.</w:t>
       </w:r>
     </w:p>
-    <w:bookmarkEnd w:id="42"/>
-    <w:bookmarkStart w:id="43" w:name="X516c8a19ee6e58ad86555097ecdb35150566fb2"/>
+    <w:bookmarkEnd w:id="43"/>
+    <w:bookmarkStart w:id="44" w:name="X516c8a19ee6e58ad86555097ecdb35150566fb2"/>
     <w:p>
       <w:pPr>
         <w:pStyle w:val="Heading3"/>
@@ -26754,7 +27907,7 @@
               <w:pStyle w:val="Compact"/>
             </w:pPr>
             <w:r>
-              <w:t xml:space="preserve">AC-45, AC-46, AC-53, AP-19</w:t>
+              <w:t xml:space="preserve">AC-45, AC-46, AC-53, AC-91, AC-93, AP-19, ACO-43</w:t>
             </w:r>
           </w:p>
         </w:tc>
@@ -26859,7 +28012,7 @@
               <w:pStyle w:val="Compact"/>
             </w:pPr>
             <w:r>
-              <w:t xml:space="preserve">AC-26, AC-37</w:t>
+              <w:t xml:space="preserve">AC-26, AC-37, AC-92, ACO-42</w:t>
             </w:r>
           </w:p>
         </w:tc>
@@ -26883,8 +28036,8 @@
         <w:t xml:space="preserve">Prepared by the authors from the risk register and the technical backlog of the project.</w:t>
       </w:r>
     </w:p>
-    <w:bookmarkEnd w:id="43"/>
-    <w:bookmarkStart w:id="44" w:name="annex-d-instructor-evaluation"/>
+    <w:bookmarkEnd w:id="44"/>
+    <w:bookmarkStart w:id="45" w:name="annex-d-instructor-evaluation"/>
     <w:p>
       <w:pPr>
         <w:pStyle w:val="Heading3"/>
@@ -26911,7 +28064,7 @@
         <w:t xml:space="preserve">85/100, grade A</w:t>
       </w:r>
       <w:r>
-        <w:t xml:space="preserve">. The five main flows (session, booking, payment, operator execution, and notices) were complete. The lowest dimensions were Documentation and traceability (59.0), Process and collaboration (68.4), API and contracts (76.7), and Tests (78.8); the documentation repository was not among those reviewed. Table 16 records the 25 findings and their status as of October 24, 2026, with</w:t>
+        <w:t xml:space="preserve">. The five main flows (session, booking, payment, operator execution, and notices) were complete. The lowest dimensions were Documentation and traceability (59.0), Process and collaboration (68.4), API and contracts (76.7), and Tests (78.8); the documentation repository was not among those reviewed. Table 16 records the 25 findings and their status as of October 27, 2026, with</w:t>
       </w:r>
       <w:r>
         <w:t xml:space="preserve"> </w:t>
@@ -26921,13 +28074,13 @@
           <w:i/>
           <w:iCs/>
         </w:rPr>
-        <w:t xml:space="preserve">develop</w:t>
+        <w:t xml:space="preserve">main</w:t>
       </w:r>
       <w:r>
         <w:t xml:space="preserve"> </w:t>
       </w:r>
       <w:r>
-        <w:t xml:space="preserve">deployed to production that day: 9 fixed, 8 partial, 6 open, 1 accepted as a risk, and 1 that cannot be fixed (on October 23 they were 5, 7, 12, 0, and 1).</w:t>
+        <w:t xml:space="preserve">in production: 11 fixed, 7 partial, 5 open, 1 accepted as a risk, and 1 that cannot be fixed (on October 24 they were 9, 8, 6, 1, and 1; on October 23, 5, 7, 12, 0, and 1).</w:t>
       </w:r>
     </w:p>
     <w:p>
@@ -27011,7 +28164,7 @@
               <w:pStyle w:val="Compact"/>
             </w:pPr>
             <w:r>
-              <w:t xml:space="preserve">Status as of 2026-10-24</w:t>
+              <w:t xml:space="preserve">Status as of 2026-10-27</w:t>
             </w:r>
           </w:p>
         </w:tc>
@@ -27078,28 +28231,18 @@
               <w:pStyle w:val="Compact"/>
             </w:pPr>
             <w:r>
-              <w:t xml:space="preserve">Partial</w:t>
-            </w:r>
-          </w:p>
-        </w:tc>
-        <w:tc>
-          <w:tcPr/>
-          <w:p>
-            <w:pPr>
-              <w:pStyle w:val="Compact"/>
-            </w:pPr>
-            <w:r>
-              <w:rPr>
-                <w:i/>
-                <w:iCs/>
-              </w:rPr>
-              <w:t xml:space="preserve">v1.0.0</w:t>
-            </w:r>
-            <w:r>
-              <w:t xml:space="preserve"> </w:t>
-            </w:r>
-            <w:r>
-              <w:t xml:space="preserve">in 9 repositories: 8 since October 23 and payment-service since the 24th (PR #2 merged,</w:t>
+              <w:t xml:space="preserve">Fixed</w:t>
+            </w:r>
+          </w:p>
+        </w:tc>
+        <w:tc>
+          <w:tcPr/>
+          <w:p>
+            <w:pPr>
+              <w:pStyle w:val="Compact"/>
+            </w:pPr>
+            <w:r>
+              <w:t xml:space="preserve">The 10 repositories have their release on</w:t>
             </w:r>
             <w:r>
               <w:t xml:space="preserve"> </w:t>
@@ -27112,39 +28255,7 @@
               <w:t xml:space="preserve">main</w:t>
             </w:r>
             <w:r>
-              <w:t xml:space="preserve"> </w:t>
-            </w:r>
-            <w:r>
-              <w:t xml:space="preserve">equal to</w:t>
-            </w:r>
-            <w:r>
-              <w:t xml:space="preserve"> </w:t>
-            </w:r>
-            <w:r>
-              <w:rPr>
-                <w:i/>
-                <w:iCs/>
-              </w:rPr>
-              <w:t xml:space="preserve">develop</w:t>
-            </w:r>
-            <w:r>
-              <w:t xml:space="preserve">); in the other 8,</w:t>
-            </w:r>
-            <w:r>
-              <w:t xml:space="preserve"> </w:t>
-            </w:r>
-            <w:r>
-              <w:rPr>
-                <w:i/>
-                <w:iCs/>
-              </w:rPr>
-              <w:t xml:space="preserve">develop</w:t>
-            </w:r>
-            <w:r>
-              <w:t xml:space="preserve"> </w:t>
-            </w:r>
-            <w:r>
-              <w:t xml:space="preserve">is ahead with the 128 branches of October 24, waiting for</w:t>
+              <w:t xml:space="preserve">:</w:t>
             </w:r>
             <w:r>
               <w:t xml:space="preserve"> </w:t>
@@ -27157,7 +28268,58 @@
               <w:t xml:space="preserve">v1.1.0</w:t>
             </w:r>
             <w:r>
-              <w:t xml:space="preserve">; the app is missing (PR #1 open, ACO-24).</w:t>
+              <w:t xml:space="preserve"> </w:t>
+            </w:r>
+            <w:r>
+              <w:t xml:space="preserve">(October 26) in the gateway, security, operations, and notification;</w:t>
+            </w:r>
+            <w:r>
+              <w:t xml:space="preserve"> </w:t>
+            </w:r>
+            <w:r>
+              <w:rPr>
+                <w:i/>
+                <w:iCs/>
+              </w:rPr>
+              <w:t xml:space="preserve">v1.1.1</w:t>
+            </w:r>
+            <w:r>
+              <w:t xml:space="preserve"> </w:t>
+            </w:r>
+            <w:r>
+              <w:t xml:space="preserve">(October 27) in customer and booking; and</w:t>
+            </w:r>
+            <w:r>
+              <w:t xml:space="preserve"> </w:t>
+            </w:r>
+            <w:r>
+              <w:rPr>
+                <w:i/>
+                <w:iCs/>
+              </w:rPr>
+              <w:t xml:space="preserve">v1.1.2</w:t>
+            </w:r>
+            <w:r>
+              <w:t xml:space="preserve"> </w:t>
+            </w:r>
+            <w:r>
+              <w:t xml:space="preserve">(October 27) in the web, the mobile app, payment, and infra. Production runs</w:t>
+            </w:r>
+            <w:r>
+              <w:t xml:space="preserve"> </w:t>
+            </w:r>
+            <w:r>
+              <w:rPr>
+                <w:i/>
+                <w:iCs/>
+              </w:rPr>
+              <w:t xml:space="preserve">main</w:t>
+            </w:r>
+            <w:r>
+              <w:t xml:space="preserve"> </w:t>
+            </w:r>
+            <w:r>
+              <w:t xml:space="preserve">through continuous deployment (AC-90).</w:t>
             </w:r>
           </w:p>
         </w:tc>
@@ -27203,7 +28365,7 @@
               <w:pStyle w:val="Compact"/>
             </w:pPr>
             <w:r>
-              <w:t xml:space="preserve">Partial</w:t>
+              <w:t xml:space="preserve">Fixed</w:t>
             </w:r>
           </w:p>
         </w:tc>
@@ -27224,7 +28386,7 @@
               <w:t xml:space="preserve"> </w:t>
             </w:r>
             <w:r>
-              <w:t xml:space="preserve">protected (CI and review) in 8 repositories; payment's PR #2 was reviewed and merged on October 24, with the CI and SonarCloud green, and the app has PR #1 open;</w:t>
+              <w:t xml:space="preserve">protected in the 10 repositories: it only takes changes through a PR approved by another member with a green CI; each release goes in through an approved «Release» PR (those of October 27 of customer, booking, payment, and infra were approved by Brayan Patiño). Protecting</w:t>
             </w:r>
             <w:r>
               <w:t xml:space="preserve"> </w:t>
@@ -27240,7 +28402,7 @@
               <w:t xml:space="preserve"> </w:t>
             </w:r>
             <w:r>
-              <w:t xml:space="preserve">is not protected (ACO-24).</w:t>
+              <w:t xml:space="preserve">remains (ACO-24).</w:t>
             </w:r>
           </w:p>
         </w:tc>
@@ -27297,7 +28459,7 @@
               <w:pStyle w:val="Compact"/>
             </w:pPr>
             <w:r>
-              <w:t xml:space="preserve">212 tests in 66 files, with the real guard and interceptor, the coupon payment, the refresh, and the translations, and coverage in the CI (web</w:t>
+              <w:t xml:space="preserve">242 tests in 68 files as of October 27, with the real guard and interceptor, the coupon payment, the refresh, and the translations, and coverage in the CI (web</w:t>
             </w:r>
             <w:r>
               <w:t xml:space="preserve"> </w:t>
@@ -27380,7 +28542,7 @@
               <w:pStyle w:val="Compact"/>
             </w:pPr>
             <w:r>
-              <w:t xml:space="preserve">73 tests in 25 suites with</w:t>
+              <w:t xml:space="preserve">106 tests with</w:t>
             </w:r>
             <w:r>
               <w:t xml:space="preserve"> </w:t>
@@ -27396,7 +28558,23 @@
               <w:t xml:space="preserve"> </w:t>
             </w:r>
             <w:r>
-              <w:t xml:space="preserve">in the CI, including the payment (</w:t>
+              <w:t xml:space="preserve">in the</w:t>
+            </w:r>
+            <w:r>
+              <w:t xml:space="preserve"> </w:t>
+            </w:r>
+            <w:r>
+              <w:rPr>
+                <w:i/>
+                <w:iCs/>
+              </w:rPr>
+              <w:t xml:space="preserve">main</w:t>
+            </w:r>
+            <w:r>
+              <w:t xml:space="preserve"> </w:t>
+            </w:r>
+            <w:r>
+              <w:t xml:space="preserve">CI as of October 27, including the payment (</w:t>
             </w:r>
             <w:r>
               <w:rPr>
@@ -28120,7 +29298,7 @@
               <w:t xml:space="preserve">573d10b</w:t>
             </w:r>
             <w:r>
-              <w:t xml:space="preserve">); it still has to run against Azure with the test accounts (ACO-26).</w:t>
+              <w:t xml:space="preserve">); payment's 17 integration tests run in the CI since October 27 and the 19 end-to-end tests passed 19 of 19 locally that day, but they still do not run on their own in the CI and the battery has not been run against Azure with the test accounts (ACO-26).</w:t>
             </w:r>
           </w:p>
         </w:tc>
@@ -28275,7 +29453,7 @@
               <w:pStyle w:val="Compact"/>
             </w:pPr>
             <w:r>
-              <w:t xml:space="preserve">Fixed</w:t>
+              <w:t xml:space="preserve">Partial</w:t>
             </w:r>
           </w:p>
         </w:tc>
@@ -28315,7 +29493,7 @@
               <w:t xml:space="preserve"> </w:t>
             </w:r>
             <w:r>
-              <w:t xml:space="preserve">and checks the web and the API (AM-17, AC-90).</w:t>
+              <w:t xml:space="preserve">and checks the web and the API (AM-17, AC-90). Availability is missing: the machine is still turned on on demand and there is no external monitor that warns if the site goes down (UptimeRobot, pending; R-011, AP-16 to AP-18).</w:t>
             </w:r>
           </w:p>
         </w:tc>
@@ -28705,18 +29883,44 @@
               <w:pStyle w:val="Compact"/>
             </w:pPr>
             <w:r>
-              <w:t xml:space="preserve">Open</w:t>
-            </w:r>
-          </w:p>
-        </w:tc>
-        <w:tc>
-          <w:tcPr/>
-          <w:p>
-            <w:pPr>
-              <w:pStyle w:val="Compact"/>
-            </w:pPr>
-            <w:r>
-              <w:t xml:space="preserve">Technical debt.</w:t>
+              <w:t xml:space="preserve">Partial</w:t>
+            </w:r>
+          </w:p>
+        </w:tc>
+        <w:tc>
+          <w:tcPr/>
+          <w:p>
+            <w:pPr>
+              <w:pStyle w:val="Compact"/>
+            </w:pPr>
+            <w:r>
+              <w:t xml:space="preserve">The home and sign-in backgrounds are served as WebP and an unused image was removed (web</w:t>
+            </w:r>
+            <w:r>
+              <w:t xml:space="preserve"> </w:t>
+            </w:r>
+            <w:r>
+              <w:rPr>
+                <w:i/>
+                <w:iCs/>
+              </w:rPr>
+              <w:t xml:space="preserve">a117d7f</w:t>
+            </w:r>
+            <w:r>
+              <w:t xml:space="preserve">,</w:t>
+            </w:r>
+            <w:r>
+              <w:t xml:space="preserve"> </w:t>
+            </w:r>
+            <w:r>
+              <w:rPr>
+                <w:i/>
+                <w:iCs/>
+              </w:rPr>
+              <w:t xml:space="preserve">v1.1.2</w:t>
+            </w:r>
+            <w:r>
+              <w:t xml:space="preserve">); some images are still to be optimized (technical debt).</w:t>
             </w:r>
           </w:p>
         </w:tc>
@@ -29042,9 +30246,9 @@
         <w:t xml:space="preserve">Prepared by the authors from the instructor's end-to-end evaluation (cutoff of October 20, 2026), the system review of October 23, and the closing audit of October 24, 2026.</w:t>
       </w:r>
     </w:p>
-    <w:bookmarkEnd w:id="44"/>
     <w:bookmarkEnd w:id="45"/>
     <w:bookmarkEnd w:id="46"/>
+    <w:bookmarkEnd w:id="47"/>
     <w:sectPr>
       <w:footnotePr>
         <w:numRestart w:val="eachSect"/>

</xml_diff>